<commit_message>
Add AI Discovery & AXP strategy doc and page content; correct AXP notes
- New strategy doc and content/ai-discovery-agent-experience.json
- Correct the AXP bullet in all four earlier strategy docs: Scrunch AXP delivery runs on
  Cloudflare, Akamai or AWS CloudFront; on Vercel, Scrunch covers agent traffic analytics only

Co-Authored-By: Claude Opus 5.5 <noreply@anthropic.com>
Claude-Session: https://claude.ai/code/session_013wwRamYmoaCu2Jj7xRXZqL
</commit_message>
<xml_diff>
--- a/docs/AI-Powered-Software-Engineering-Strategy.docx
+++ b/docs/AI-Powered-Software-Engineering-Strategy.docx
@@ -20240,7 +20240,7 @@
           <w:sz w:val="21"/>
           <w:szCs w:val="21"/>
         </w:rPr>
-        <w:t xml:space="preserve"> Scrunch's Agent Experience Platform detects AI agent traffic at the CDN (it integrates with Akamai, Cloudflare and Vercel) and serves those agents an AI-optimized, server-rendered version of the page, while people and Googlebot see the normal site. Because the new site runs on Vercel, AXP can be added later without code changes.</w:t>
+        <w:t xml:space="preserve"> Scrunch's Agent Experience Platform runs at the CDN edge (Cloudflare, Akamai or AWS CloudFront): it detects AI agents and serves them an optimized, server-rendered version of the page while people see the normal site. On Vercel alone, Scrunch can track AI agent traffic through log drains; serving AXP content needs one of those CDNs in front of the site. This page is already server-rendered, so AI agents can read it today.</w:t>
       </w:r>
     </w:p>
     <w:p>
@@ -21377,7 +21377,7 @@
         </w:numPr>
         <w:spacing w:after="80"/>
       </w:pPr>
-      <w:hyperlink w:history="1" r:id="rIdzfurkci_tkvalhztvig7y">
+      <w:hyperlink w:history="1" r:id="rIdlu1zcwhrllchcrsy0bewh">
         <w:r>
           <w:rPr>
             <w:rFonts w:ascii="Aptos" w:cs="Aptos" w:eastAsia="Aptos" w:hAnsi="Aptos"/>
@@ -21399,7 +21399,7 @@
         </w:numPr>
         <w:spacing w:after="80"/>
       </w:pPr>
-      <w:hyperlink w:history="1" r:id="rIdybuqecr-bmvt54xog0lic">
+      <w:hyperlink w:history="1" r:id="rId-klrzbi7km217xjrjp729">
         <w:r>
           <w:rPr>
             <w:rFonts w:ascii="Aptos" w:cs="Aptos" w:eastAsia="Aptos" w:hAnsi="Aptos"/>
@@ -21421,7 +21421,7 @@
         </w:numPr>
         <w:spacing w:after="80"/>
       </w:pPr>
-      <w:hyperlink w:history="1" r:id="rIdki-jynxsldez0oh0fvf39">
+      <w:hyperlink w:history="1" r:id="rId3smg346c75gqrbwppxp8t">
         <w:r>
           <w:rPr>
             <w:rFonts w:ascii="Aptos" w:cs="Aptos" w:eastAsia="Aptos" w:hAnsi="Aptos"/>
@@ -21443,7 +21443,7 @@
         </w:numPr>
         <w:spacing w:after="80"/>
       </w:pPr>
-      <w:hyperlink w:history="1" r:id="rId3fc6afscvkfmxl3c3h_wj">
+      <w:hyperlink w:history="1" r:id="rIdfbckez3homlpcagfjnd8r">
         <w:r>
           <w:rPr>
             <w:rFonts w:ascii="Aptos" w:cs="Aptos" w:eastAsia="Aptos" w:hAnsi="Aptos"/>
@@ -21465,7 +21465,7 @@
         </w:numPr>
         <w:spacing w:after="80"/>
       </w:pPr>
-      <w:hyperlink w:history="1" r:id="rIdwcjltvhvuxe6zdusjz61h">
+      <w:hyperlink w:history="1" r:id="rIdwutrbswkye6anmmjoahds">
         <w:r>
           <w:rPr>
             <w:rFonts w:ascii="Aptos" w:cs="Aptos" w:eastAsia="Aptos" w:hAnsi="Aptos"/>
@@ -21487,7 +21487,7 @@
         </w:numPr>
         <w:spacing w:after="80"/>
       </w:pPr>
-      <w:hyperlink w:history="1" r:id="rIdnijkxwhx73z7ioxlreci2">
+      <w:hyperlink w:history="1" r:id="rIdcqegj5xyhqhhgvt4nvdbj">
         <w:r>
           <w:rPr>
             <w:rFonts w:ascii="Aptos" w:cs="Aptos" w:eastAsia="Aptos" w:hAnsi="Aptos"/>

</xml_diff>